<commit_message>
missctapp: opening, amicus and reply briefs gated on the shared model at bd6599e5c (widow/orphan, unsplit notes, equal finds landed); reply docx delivered, reported; reply authorities list the subsections again (fb-595.54.69)
Co-Authored-By: Claude Opus 5.5 <noreply@anthropic.com>
</commit_message>
<xml_diff>
--- a/courts/fifth-circuit/mississippi/state/court-of-appeals/amicus-brief/usage/OUTPUT-amicus-brief.docx
+++ b/courts/fifth-circuit/mississippi/state/court-of-appeals/amicus-brief/usage/OUTPUT-amicus-brief.docx
@@ -4879,7 +4879,7 @@
               <w:t xml:space="preserve"> </w:t>
             </w:r>
             <w:r>
-              <w:t xml:space="preserve">www.McCartyAppeals.com</w:t>
+              <w:t xml:space="preserve">www.​McCartyAppeals.​com</w:t>
             </w:r>
           </w:p>
           <w:p>
@@ -5890,7 +5890,7 @@
         <w:t xml:space="preserve"> </w:t>
       </w:r>
       <w:r>
-        <w:t xml:space="preserve">www.McCartyAppeals.com</w:t>
+        <w:t xml:space="preserve">www.​McCartyAppeals.​com</w:t>
       </w:r>
     </w:p>
     <w:p>
@@ -7717,6 +7717,7 @@
     <w:unhideWhenUsed/>
     <w:qFormat/>
     <w:pPr>
+      <w:keepLines/>
       <w:spacing w:before="0" w:after="120" w:line="253" w:lineRule="exact"/>
     </w:pPr>
     <w:rPr>
@@ -7967,6 +7968,33 @@
     <w:pPr>
       <w:spacing w:before="0" w:after="0" w:line="276" w:lineRule="exact"/>
       <w:ind w:left="2160" w:hanging="720"/>
+    </w:pPr>
+  </w:style>
+  <w:style w:type="paragraph" w:customStyle="1" w:styleId="XdQuoteList1">
+    <w:name w:val="Xd Quote List 1"/>
+    <w:basedOn w:val="Normal"/>
+    <w:qFormat/>
+    <w:pPr>
+      <w:spacing w:before="0" w:after="0" w:line="276" w:lineRule="exact"/>
+      <w:ind w:left="1440" w:right="720" w:hanging="720"/>
+    </w:pPr>
+  </w:style>
+  <w:style w:type="paragraph" w:customStyle="1" w:styleId="XdQuoteList2">
+    <w:name w:val="Xd Quote List 2"/>
+    <w:basedOn w:val="Normal"/>
+    <w:qFormat/>
+    <w:pPr>
+      <w:spacing w:before="0" w:after="0" w:line="276" w:lineRule="exact"/>
+      <w:ind w:left="2160" w:right="720" w:hanging="720"/>
+    </w:pPr>
+  </w:style>
+  <w:style w:type="paragraph" w:customStyle="1" w:styleId="XdQuoteList3">
+    <w:name w:val="Xd Quote List 3"/>
+    <w:basedOn w:val="Normal"/>
+    <w:qFormat/>
+    <w:pPr>
+      <w:spacing w:before="0" w:after="0" w:line="276" w:lineRule="exact"/>
+      <w:ind w:left="2880" w:right="720" w:hanging="720"/>
     </w:pPr>
   </w:style>
   <w:style w:type="paragraph" w:customStyle="1" w:styleId="SourceCode">

</xml_diff>